<commit_message>
docs(tong_quan): add study↔chapter figure (2.2); pin figures in print build
Complete the print figure set so the DOCX/PDF carry all three section-2 diagrams:
- render_overview_figs.py: new study_chapter_map() renders fig_study_chapter_map.png
  (bipartite: component studies/chuyên đề on the left -> chapters on the right,
  with the Ch.1->Ch.5 spine), matching the Mục 2.2 Mermaid source.
- preprocess_tong_quan.py: place Hình 2.2 at section 2.2 (drops the prior source
  note; all three sections now carry a real figure).
- build_tong_quan_overview.sh: float placement [H] (float + floatplacement) so
  each figure stays under its own heading instead of floating to a later page.

Rebuilt dist/ outputs: 10pp A4, three figures embedded (DOCX 3 media, PDF 3
images), no raw Mermaid. Existing two PNGs left unchanged.

Co-Authored-By: Claude Opus 4.8 <noreply@anthropic.com>
Claude-Session: https://claude.ai/code/session_01W9KijTAjAjpzgk4mKrsimg
</commit_message>
<xml_diff>
--- a/dist/tong_quan_luan_an/TONG_QUAN_LUAN_AN.docx
+++ b/dist/tong_quan_luan_an/TONG_QUAN_LUAN_AN.docx
@@ -1935,7 +1935,7 @@
     </w:p>
     <w:bookmarkEnd w:id="26"/>
     <w:bookmarkEnd w:id="27"/>
-    <w:bookmarkStart w:id="39" w:name="X422ae81f7bf257aec75a3020de01425a521dbdc"/>
+    <w:bookmarkStart w:id="42" w:name="X422ae81f7bf257aec75a3020de01425a521dbdc"/>
     <w:p>
       <w:pPr>
         <w:pStyle w:val="Heading1"/>
@@ -2061,92 +2061,13 @@
       </w:r>
     </w:p>
     <w:bookmarkEnd w:id="31"/>
-    <w:bookmarkStart w:id="32" w:name="X21e49a0144ef5405d4befac539f9088f4e6ef85"/>
+    <w:bookmarkStart w:id="35" w:name="X21e49a0144ef5405d4befac539f9088f4e6ef85"/>
     <w:p>
       <w:pPr>
         <w:pStyle w:val="Heading2"/>
       </w:pPr>
       <w:r>
         <w:t xml:space="preserve">2.2 Ánh xạ nghiên cứu thành phần ↔ chương luận án</w:t>
-      </w:r>
-    </w:p>
-    <w:p>
-      <w:pPr>
-        <w:pStyle w:val="BlockText"/>
-      </w:pPr>
-      <w:r>
-        <w:rPr>
-          <w:iCs/>
-          <w:i/>
-        </w:rPr>
-        <w:t xml:space="preserve">Sơ đồ ánh xạ nghiên cứu thành phần ↔ chương luận án có ở bản Mermaid trên kho lưu trữ (</w:t>
-      </w:r>
-      <w:r>
-        <w:rPr>
-          <w:rStyle w:val="VerbatimChar"/>
-          <w:iCs/>
-          <w:i/>
-        </w:rPr>
-        <w:t xml:space="preserve">tong_quan_luan_an/02_truc_quan_hoa_quan_he.md</w:t>
-      </w:r>
-      <w:r>
-        <w:rPr>
-          <w:iCs/>
-          <w:i/>
-        </w:rPr>
-        <w:t xml:space="preserve">); nội dung tương ứng được tóm trong Bảng</w:t>
-      </w:r>
-      <w:r>
-        <w:rPr>
-          <w:iCs/>
-          <w:i/>
-        </w:rPr>
-        <w:t xml:space="preserve"> </w:t>
-      </w:r>
-      <w:r>
-        <w:rPr>
-          <w:iCs/>
-          <w:i/>
-        </w:rPr>
-        <w:t xml:space="preserve">“</w:t>
-      </w:r>
-      <w:r>
-        <w:rPr>
-          <w:iCs/>
-          <w:i/>
-        </w:rPr>
-        <w:t xml:space="preserve">sợi chỉ vàng</w:t>
-      </w:r>
-      <w:r>
-        <w:rPr>
-          <w:iCs/>
-          <w:i/>
-        </w:rPr>
-        <w:t xml:space="preserve">”</w:t>
-      </w:r>
-      <w:r>
-        <w:rPr>
-          <w:iCs/>
-          <w:i/>
-        </w:rPr>
-        <w:t xml:space="preserve"> </w:t>
-      </w:r>
-      <w:r>
-        <w:rPr>
-          <w:iCs/>
-          <w:i/>
-        </w:rPr>
-        <w:t xml:space="preserve">ở Mục 2.4.</w:t>
-      </w:r>
-    </w:p>
-    <w:bookmarkEnd w:id="32"/>
-    <w:bookmarkStart w:id="36" w:name="hình-thái-ba-vùng-theo-phổ-thể-chế-icrv"/>
-    <w:p>
-      <w:pPr>
-        <w:pStyle w:val="Heading2"/>
-      </w:pPr>
-      <w:r>
-        <w:t xml:space="preserve">2.3 Hình thái ba vùng theo phổ thể chế ICRV</w:t>
       </w:r>
     </w:p>
     <w:p>
@@ -2156,20 +2077,95 @@
       <w:r>
         <w:drawing>
           <wp:inline>
-            <wp:extent cx="4890135" cy="2688652"/>
+            <wp:extent cx="4890135" cy="3180398"/>
             <wp:effectExtent b="0" l="0" r="0" t="0"/>
-            <wp:docPr descr="Hình 2.3. Hình thái ba vùng của quan hệ quốc tế hóa–hiệu quả theo phổ thể chế ICRV (biên trên gần tuyến tính · vùng giữa chữ U ngược · biên dưới mất cấu trúc / FIP)." title="" id="34" name="Picture"/>
+            <wp:docPr descr="Hình 2.2. Ánh xạ nghiên cứu thành phần · chuyên đề → chương luận án (trục xương sống Ch.1→Ch.5 là mạch lập luận; cung xiên là đầu vào nội dung)." title="" id="33" name="Picture"/>
             <a:graphic>
               <a:graphicData uri="http://schemas.openxmlformats.org/drawingml/2006/picture">
                 <pic:pic>
                   <pic:nvPicPr>
-                    <pic:cNvPr descr="tong_quan_luan_an/figures/fig_three_zone.png" id="35" name="Picture"/>
+                    <pic:cNvPr descr="tong_quan_luan_an/figures/fig_study_chapter_map.png" id="34" name="Picture"/>
                     <pic:cNvPicPr>
                       <a:picLocks noChangeArrowheads="1" noChangeAspect="1"/>
                     </pic:cNvPicPr>
                   </pic:nvPicPr>
                   <pic:blipFill>
-                    <a:blip r:embed="rId33"/>
+                    <a:blip r:embed="rId32"/>
+                    <a:stretch>
+                      <a:fillRect/>
+                    </a:stretch>
+                  </pic:blipFill>
+                  <pic:spPr bwMode="auto">
+                    <a:xfrm>
+                      <a:off x="0" y="0"/>
+                      <a:ext cx="4890135" cy="3180398"/>
+                    </a:xfrm>
+                    <a:prstGeom prst="rect">
+                      <a:avLst/>
+                    </a:prstGeom>
+                    <a:noFill/>
+                    <a:ln w="9525">
+                      <a:noFill/>
+                      <a:headEnd/>
+                      <a:tailEnd/>
+                    </a:ln>
+                  </pic:spPr>
+                </pic:pic>
+              </a:graphicData>
+            </a:graphic>
+          </wp:inline>
+        </w:drawing>
+      </w:r>
+    </w:p>
+    <w:p>
+      <w:pPr>
+        <w:pStyle w:val="ImageCaption"/>
+      </w:pPr>
+      <w:r>
+        <w:rPr>
+          <w:bCs/>
+          <w:b/>
+        </w:rPr>
+        <w:t xml:space="preserve">Hình 2.2.</w:t>
+      </w:r>
+      <w:r>
+        <w:t xml:space="preserve"> </w:t>
+      </w:r>
+      <w:r>
+        <w:t xml:space="preserve">Ánh xạ nghiên cứu thành phần · chuyên đề → chương luận án (trục xương sống Ch.1→Ch.5 là mạch lập luận; cung xiên là đầu vào nội dung).</w:t>
+      </w:r>
+    </w:p>
+    <w:bookmarkEnd w:id="35"/>
+    <w:bookmarkStart w:id="39" w:name="hình-thái-ba-vùng-theo-phổ-thể-chế-icrv"/>
+    <w:p>
+      <w:pPr>
+        <w:pStyle w:val="Heading2"/>
+      </w:pPr>
+      <w:r>
+        <w:t xml:space="preserve">2.3 Hình thái ba vùng theo phổ thể chế ICRV</w:t>
+      </w:r>
+    </w:p>
+    <w:p>
+      <w:pPr>
+        <w:pStyle w:val="CaptionedFigure"/>
+      </w:pPr>
+      <w:r>
+        <w:drawing>
+          <wp:inline>
+            <wp:extent cx="4890135" cy="2688652"/>
+            <wp:effectExtent b="0" l="0" r="0" t="0"/>
+            <wp:docPr descr="Hình 2.3. Hình thái ba vùng của quan hệ quốc tế hóa–hiệu quả theo phổ thể chế ICRV (biên trên gần tuyến tính · vùng giữa chữ U ngược · biên dưới mất cấu trúc / FIP)." title="" id="37" name="Picture"/>
+            <a:graphic>
+              <a:graphicData uri="http://schemas.openxmlformats.org/drawingml/2006/picture">
+                <pic:pic>
+                  <pic:nvPicPr>
+                    <pic:cNvPr descr="tong_quan_luan_an/figures/fig_three_zone.png" id="38" name="Picture"/>
+                    <pic:cNvPicPr>
+                      <a:picLocks noChangeArrowheads="1" noChangeAspect="1"/>
+                    </pic:cNvPicPr>
+                  </pic:nvPicPr>
+                  <pic:blipFill>
+                    <a:blip r:embed="rId36"/>
                     <a:stretch>
                       <a:fillRect/>
                     </a:stretch>
@@ -2214,8 +2210,8 @@
         <w:t xml:space="preserve">Hình thái ba vùng của quan hệ quốc tế hóa–hiệu quả theo phổ thể chế ICRV (biên trên gần tuyến tính · vùng giữa chữ U ngược · biên dưới mất cấu trúc / FIP).</w:t>
       </w:r>
     </w:p>
-    <w:bookmarkEnd w:id="36"/>
-    <w:bookmarkStart w:id="37" w:name="X6e2ac6a0c1c7e879fbfb17433df9dd088cbe2dd"/>
+    <w:bookmarkEnd w:id="39"/>
+    <w:bookmarkStart w:id="40" w:name="X6e2ac6a0c1c7e879fbfb17433df9dd088cbe2dd"/>
     <w:p>
       <w:pPr>
         <w:pStyle w:val="Heading2"/>
@@ -3193,8 +3189,8 @@
         <w:t xml:space="preserve">Nhóm ICRV: I = tiên tiến đổi mới; III = trung bình cao; IV = chuyển đổi thu nhập trung bình thấp; V = đang nổi; VI = SIDS. Nguồn: tác giả tổng hợp; số liệu trích Mục 5.6.1 và 4.2–4.9.</w:t>
       </w:r>
     </w:p>
-    <w:bookmarkEnd w:id="37"/>
-    <w:bookmarkStart w:id="38" w:name="cách-đọc"/>
+    <w:bookmarkEnd w:id="40"/>
+    <w:bookmarkStart w:id="41" w:name="cách-đọc"/>
     <w:p>
       <w:pPr>
         <w:pStyle w:val="Heading2"/>
@@ -3309,9 +3305,9 @@
         <w:t xml:space="preserve">43% của Nhóm IV (P7) — dù được ước lượng độc lập từ ba nguồn dữ liệu khác nhau.</w:t>
       </w:r>
     </w:p>
-    <w:bookmarkEnd w:id="38"/>
-    <w:bookmarkEnd w:id="39"/>
-    <w:bookmarkStart w:id="50" w:name="tính-đóng-góp-và-tính-mới-của-luận-án"/>
+    <w:bookmarkEnd w:id="41"/>
+    <w:bookmarkEnd w:id="42"/>
+    <w:bookmarkStart w:id="53" w:name="tính-đóng-góp-và-tính-mới-của-luận-án"/>
     <w:p>
       <w:pPr>
         <w:pStyle w:val="Heading1"/>
@@ -3360,7 +3356,7 @@
         <w:t xml:space="preserve">(scope conditions).</w:t>
       </w:r>
     </w:p>
-    <w:bookmarkStart w:id="40" w:name="khung-đánh-giá-đóng-góp"/>
+    <w:bookmarkStart w:id="43" w:name="khung-đánh-giá-đóng-góp"/>
     <w:p>
       <w:pPr>
         <w:pStyle w:val="Heading2"/>
@@ -3592,8 +3588,8 @@
         <w:t xml:space="preserve">sự biến thiên xuyên bối cảnh của dạng hàm thành một quy luật kiểm định được.</w:t>
       </w:r>
     </w:p>
-    <w:bookmarkEnd w:id="40"/>
-    <w:bookmarkStart w:id="45" w:name="bốn-đóng-góp-lý-thuyết-cốt-lõi"/>
+    <w:bookmarkEnd w:id="43"/>
+    <w:bookmarkStart w:id="48" w:name="bốn-đóng-góp-lý-thuyết-cốt-lõi"/>
     <w:p>
       <w:pPr>
         <w:pStyle w:val="Heading2"/>
@@ -3602,7 +3598,7 @@
         <w:t xml:space="preserve">3.2 Bốn đóng góp lý thuyết cốt lõi</w:t>
       </w:r>
     </w:p>
-    <w:bookmarkStart w:id="41" w:name="Xaae90ce32b2da1e1a27a2741054f6a8483aff5b"/>
+    <w:bookmarkStart w:id="44" w:name="Xaae90ce32b2da1e1a27a2741054f6a8483aff5b"/>
     <w:p>
       <w:pPr>
         <w:pStyle w:val="Heading3"/>
@@ -3857,8 +3853,8 @@
         <w:t xml:space="preserve">thiếu hụt thể chế.</w:t>
       </w:r>
     </w:p>
-    <w:bookmarkEnd w:id="41"/>
-    <w:bookmarkStart w:id="42" w:name="X751a4d6f91bc4b5451d8f106fe6bd255c55dddb"/>
+    <w:bookmarkEnd w:id="44"/>
+    <w:bookmarkStart w:id="45" w:name="X751a4d6f91bc4b5451d8f106fe6bd255c55dddb"/>
     <w:p>
       <w:pPr>
         <w:pStyle w:val="Heading3"/>
@@ -4131,8 +4127,8 @@
         <w:t xml:space="preserve">phải headline. Kiểm định FIP dứt khoát cần mẫu SIDS lớn hơn (hướng tương lai).</w:t>
       </w:r>
     </w:p>
-    <w:bookmarkEnd w:id="42"/>
-    <w:bookmarkStart w:id="43" w:name="X9836484b1f8f3b7afed3958d30575205a5775bf"/>
+    <w:bookmarkEnd w:id="45"/>
+    <w:bookmarkStart w:id="46" w:name="X9836484b1f8f3b7afed3958d30575205a5775bf"/>
     <w:p>
       <w:pPr>
         <w:pStyle w:val="Heading3"/>
@@ -4289,8 +4285,8 @@
         <w:t xml:space="preserve">dạng hàm.</w:t>
       </w:r>
     </w:p>
-    <w:bookmarkEnd w:id="43"/>
-    <w:bookmarkStart w:id="44" w:name="X468236acbdc4990e4d66f2447971649bb02ac33"/>
+    <w:bookmarkEnd w:id="46"/>
+    <w:bookmarkStart w:id="47" w:name="X468236acbdc4990e4d66f2447971649bb02ac33"/>
     <w:p>
       <w:pPr>
         <w:pStyle w:val="Heading3"/>
@@ -4444,9 +4440,9 @@
         <w:t xml:space="preserve">bên cạnh điều kiện biên không gian (SIDS) — làm khung lý thuyết tự-giới-hạn phạm vi một cách tường minh.</w:t>
       </w:r>
     </w:p>
-    <w:bookmarkEnd w:id="44"/>
-    <w:bookmarkEnd w:id="45"/>
-    <w:bookmarkStart w:id="46" w:name="Xd0faa0df3949758dca5e4a5407173f58fb8ac21"/>
+    <w:bookmarkEnd w:id="47"/>
+    <w:bookmarkEnd w:id="48"/>
+    <w:bookmarkStart w:id="49" w:name="Xd0faa0df3949758dca5e4a5407173f58fb8ac21"/>
     <w:p>
       <w:pPr>
         <w:pStyle w:val="Heading2"/>
@@ -4561,8 +4557,8 @@
         <w:t xml:space="preserve">mà không nghiên cứu thành phần đơn lẻ nào tạo ra được.</w:t>
       </w:r>
     </w:p>
-    <w:bookmarkEnd w:id="46"/>
-    <w:bookmarkStart w:id="47" w:name="đóng-góp-phương-pháp-dữ-liệu"/>
+    <w:bookmarkEnd w:id="49"/>
+    <w:bookmarkStart w:id="50" w:name="đóng-góp-phương-pháp-dữ-liệu"/>
     <w:p>
       <w:pPr>
         <w:pStyle w:val="Heading2"/>
@@ -4684,8 +4680,8 @@
         <w:t xml:space="preserve">) chạy từ vi dữ liệu thô; gói OSF + script tái lập.</w:t>
       </w:r>
     </w:p>
-    <w:bookmarkEnd w:id="47"/>
-    <w:bookmarkStart w:id="48" w:name="tính-mới-tóm-tắt-một-dòng"/>
+    <w:bookmarkEnd w:id="50"/>
+    <w:bookmarkStart w:id="51" w:name="tính-mới-tóm-tắt-một-dòng"/>
     <w:p>
       <w:pPr>
         <w:pStyle w:val="Heading2"/>
@@ -5079,8 +5075,8 @@
         </w:tc>
       </w:tr>
     </w:tbl>
-    <w:bookmarkEnd w:id="48"/>
-    <w:bookmarkStart w:id="49" w:name="ghi-chú-liêm-chính-khoa-học"/>
+    <w:bookmarkEnd w:id="51"/>
+    <w:bookmarkStart w:id="52" w:name="ghi-chú-liêm-chính-khoa-học"/>
     <w:p>
       <w:pPr>
         <w:pStyle w:val="Heading2"/>
@@ -5202,9 +5198,9 @@
         <w:t xml:space="preserve">(ngoài container); headline r̄/k/Q_M đã tái lập.</w:t>
       </w:r>
     </w:p>
-    <w:bookmarkEnd w:id="49"/>
-    <w:bookmarkEnd w:id="50"/>
-    <w:bookmarkStart w:id="58" w:name="X74fdb2dcd539ac9d43e0621f106ff33ae86ab2e"/>
+    <w:bookmarkEnd w:id="52"/>
+    <w:bookmarkEnd w:id="53"/>
+    <w:bookmarkStart w:id="61" w:name="X74fdb2dcd539ac9d43e0621f106ff33ae86ab2e"/>
     <w:p>
       <w:pPr>
         <w:pStyle w:val="Heading1"/>
@@ -5233,7 +5229,7 @@
         <w:t xml:space="preserve">. Định vị luận án so với 6 chương trình nghiên cứu (research programs) tương đương, 4 luận án/công trình kinh điển, và mảng luận án châu Á/Việt Nam cùng chủ đề.</w:t>
       </w:r>
     </w:p>
-    <w:bookmarkStart w:id="51" w:name="X41939886b5a21f459bf7169bb6a7c8e8b45dd83"/>
+    <w:bookmarkStart w:id="54" w:name="X41939886b5a21f459bf7169bb6a7c8e8b45dd83"/>
     <w:p>
       <w:pPr>
         <w:pStyle w:val="Heading2"/>
@@ -5340,8 +5336,8 @@
         <w:t xml:space="preserve">có cấu trúc tương đương (chùm nghiên cứu thành phần P1–P10 + chương sách + meta, 50 nền gồm Nhật Bản, phủ tới SIDS).</w:t>
       </w:r>
     </w:p>
-    <w:bookmarkEnd w:id="51"/>
-    <w:bookmarkStart w:id="52" w:name="X5d0d4c0cc7c4e9981b1fe3b0153fec74a887649"/>
+    <w:bookmarkEnd w:id="54"/>
+    <w:bookmarkStart w:id="55" w:name="X5d0d4c0cc7c4e9981b1fe3b0153fec74a887649"/>
     <w:p>
       <w:pPr>
         <w:pStyle w:val="Heading2"/>
@@ -5870,8 +5866,8 @@
         </w:tc>
       </w:tr>
     </w:tbl>
-    <w:bookmarkEnd w:id="52"/>
-    <w:bookmarkStart w:id="53" w:name="so-với-4-luận-áncông-trình-kinh-điển"/>
+    <w:bookmarkEnd w:id="55"/>
+    <w:bookmarkStart w:id="56" w:name="so-với-4-luận-áncông-trình-kinh-điển"/>
     <w:p>
       <w:pPr>
         <w:pStyle w:val="Heading2"/>
@@ -6242,8 +6238,8 @@
         </w:tc>
       </w:tr>
     </w:tbl>
-    <w:bookmarkEnd w:id="53"/>
-    <w:bookmarkStart w:id="54" w:name="Xc132ca7813fd2dfd2652e4227bc53cf5cb67e99"/>
+    <w:bookmarkEnd w:id="56"/>
+    <w:bookmarkStart w:id="57" w:name="Xc132ca7813fd2dfd2652e4227bc53cf5cb67e99"/>
     <w:p>
       <w:pPr>
         <w:pStyle w:val="Heading2"/>
@@ -6528,8 +6524,8 @@
         <w:t xml:space="preserve">.</w:t>
       </w:r>
     </w:p>
-    <w:bookmarkEnd w:id="54"/>
-    <w:bookmarkStart w:id="55" w:name="X79651c001fae4c29cdc7025ed79bbefd2e9f410"/>
+    <w:bookmarkEnd w:id="57"/>
+    <w:bookmarkStart w:id="58" w:name="X79651c001fae4c29cdc7025ed79bbefd2e9f410"/>
     <w:p>
       <w:pPr>
         <w:pStyle w:val="Heading2"/>
@@ -7477,8 +7473,8 @@
         </w:tc>
       </w:tr>
     </w:tbl>
-    <w:bookmarkEnd w:id="55"/>
-    <w:bookmarkStart w:id="56" w:name="Xc9e870e4ae2d19a4cf421b64bd8ac31a294e87f"/>
+    <w:bookmarkEnd w:id="58"/>
+    <w:bookmarkStart w:id="59" w:name="Xc9e870e4ae2d19a4cf421b64bd8ac31a294e87f"/>
     <w:p>
       <w:pPr>
         <w:pStyle w:val="Heading2"/>
@@ -7715,8 +7711,8 @@
         <w:t xml:space="preserve">.</w:t>
       </w:r>
     </w:p>
-    <w:bookmarkEnd w:id="56"/>
-    <w:bookmarkStart w:id="57" w:name="một-câu-định-vị"/>
+    <w:bookmarkEnd w:id="59"/>
+    <w:bookmarkStart w:id="60" w:name="một-câu-định-vị"/>
     <w:p>
       <w:pPr>
         <w:pStyle w:val="Heading2"/>
@@ -7778,8 +7774,8 @@
         <w:t xml:space="preserve">, và xác định tường minh ranh giới (SIDS, chuyển đổi cực mạnh) nơi các lý thuyết phổ quát ngừng áp dụng.</w:t>
       </w:r>
     </w:p>
-    <w:bookmarkEnd w:id="57"/>
-    <w:bookmarkEnd w:id="58"/>
+    <w:bookmarkEnd w:id="60"/>
+    <w:bookmarkEnd w:id="61"/>
     <w:sectPr>
       <w:pgSz w:h="16838" w:w="11906"/>
       <w:pgMar w:bottom="1134" w:left="1701" w:right="1134" w:top="1134"/>

</xml_diff>